<commit_message>
docs: refresh markdown and docx validation pack
</commit_message>
<xml_diff>
--- a/CSV108_docx/001_CSV_Lifecycle_Management_Procedure.docx
+++ b/CSV108_docx/001_CSV_Lifecycle_Management_Procedure.docx
@@ -2481,6 +2481,52 @@
     </w:p>
     <w:p>
       <w:pPr>
+        <w:pStyle w:val="Heading2"/>
+      </w:pPr>
+      <w:r>
+        <w:t>5.9 Exceptions, deviations and temporary controls</w:t>
+      </w:r>
+    </w:p>
+    <w:p>
+      <w:pPr>
+        <w:spacing w:after="120" w:line="300" w:lineRule="auto"/>
+      </w:pPr>
+      <w:r>
+        <w:rPr>
+          <w:rFonts w:ascii="Calibri" w:hAnsi="Calibri"/>
+          <w:b w:val="0"/>
+          <w:i w:val="0"/>
+          <w:color w:val="000000"/>
+          <w:sz w:val="22"/>
+        </w:rPr>
+        <w:t>Any departure from this procedure shall be documented before execution where practical, or within one business day for urgent actions taken to protect product, patient, data or business continuity. The record shall describe the affected system, regulated process, records at risk, interim control, owner, due date and QA disposition. Temporary manual controls may be used only when they are approved, traceable to affected records and reconciled after system restoration.</w:t>
+      </w:r>
+    </w:p>
+    <w:p>
+      <w:pPr>
+        <w:pStyle w:val="Heading2"/>
+      </w:pPr>
+      <w:r>
+        <w:t>5.10 Traceability and evidence standards</w:t>
+      </w:r>
+    </w:p>
+    <w:p>
+      <w:pPr>
+        <w:spacing w:after="120" w:line="300" w:lineRule="auto"/>
+      </w:pPr>
+      <w:r>
+        <w:rPr>
+          <w:rFonts w:ascii="Calibri" w:hAnsi="Calibri"/>
+          <w:b w:val="0"/>
+          <w:i w:val="0"/>
+          <w:color w:val="000000"/>
+          <w:sz w:val="22"/>
+        </w:rPr>
+        <w:t>Lifecycle evidence shall be attributable, legible, contemporaneous, original or certified copy, accurate, complete, consistent, enduring and available. Requirements, risks, design/configuration items and verification evidence shall be linked sufficiently for an independent reviewer to reconstruct why a control was required, how it was implemented and how it was verified. Supplier evidence may support but shall not replace site acceptance of intended use.</w:t>
+      </w:r>
+    </w:p>
+    <w:p>
+      <w:pPr>
         <w:pStyle w:val="Heading1"/>
       </w:pPr>
       <w:r>
@@ -3199,6 +3245,21 @@
       <w:pPr>
         <w:spacing w:after="80"/>
       </w:pPr>
+    </w:p>
+    <w:p>
+      <w:pPr>
+        <w:spacing w:after="120" w:line="300" w:lineRule="auto"/>
+      </w:pPr>
+      <w:r>
+        <w:rPr>
+          <w:rFonts w:ascii="Calibri" w:hAnsi="Calibri"/>
+          <w:b w:val="0"/>
+          <w:i w:val="0"/>
+          <w:color w:val="000000"/>
+          <w:sz w:val="22"/>
+        </w:rPr>
+        <w:t>Gate approval shall cite the current deliverable list, unresolved deviations, open risks, accepted residual risks and any deferred activities. A gate may be conditionally passed only when QA confirms that the condition does not permit unvalidated regulated use and that a named owner/date exists for closure.</w:t>
+      </w:r>
     </w:p>
     <w:p>
       <w:pPr>

</xml_diff>